<commit_message>
feat: :sparkles: (Changes) Implements changes to version 3
</commit_message>
<xml_diff>
--- a/Fase-1-Diseno-Red-Corporativa/Fase 1 Proyecto Final.docx
+++ b/Fase-1-Diseno-Red-Corporativa/Fase 1 Proyecto Final.docx
@@ -269,7 +269,7 @@
           <w:b w:val="false"/>
           <w:bCs w:val="false"/>
         </w:rPr>
-        <w:t xml:space="preserve">1. Introducción</w:t>
+        <w:t xml:space="preserve">Introducción</w:t>
       </w:r>
     </w:p>
     <w:p>
@@ -505,7 +505,7 @@
           <w:b w:val="false"/>
           <w:bCs w:val="false"/>
         </w:rPr>
-        <w:t xml:space="preserve">1.1 Metodología general seguida</w:t>
+        <w:t xml:space="preserve">Metodología general seguida</w:t>
       </w:r>
     </w:p>
     <w:p>
@@ -715,7 +715,7 @@
           <w:b w:val="false"/>
           <w:bCs w:val="false"/>
         </w:rPr>
-        <w:t xml:space="preserve">1.2 Alcance: diseño de producción y equivalencia con el laboratorio de Fase 4</w:t>
+        <w:t xml:space="preserve">Alcance: diseño de producción y equivalencia con el laboratorio de Fase 4</w:t>
       </w:r>
     </w:p>
     <w:p>
@@ -14496,7 +14496,7 @@
           <w:szCs w:val="20"/>
           <w:shd w:fill="EDEDED" w:val="clear"/>
         </w:rPr>
-        <w:t xml:space="preserve">172.20.0.0/16</w:t>
+        <w:t xml:space="preserve">172.16.0.0/16</w:t>
       </w:r>
       <w:r>
         <w:rPr>
@@ -14727,7 +14727,7 @@
           <w:b/>
           <w:bCs/>
         </w:rPr>
-        <w:t xml:space="preserve">172.20.0.0/16</w:t>
+        <w:t xml:space="preserve">172.16.0.0/16</w:t>
       </w:r>
       <w:r>
         <w:rPr>
@@ -15648,7 +15648,7 @@
           <w:szCs w:val="20"/>
           <w:shd w:fill="EDEDED" w:val="clear"/>
         </w:rPr>
-        <w:t xml:space="preserve">172.20.0.0/16</w:t>
+        <w:t xml:space="preserve">172.16.0.0/16</w:t>
       </w:r>
       <w:r>
         <w:rPr>
@@ -15703,7 +15703,7 @@
           <w:szCs w:val="20"/>
           <w:shd w:fill="EDEDED" w:val="clear"/>
         </w:rPr>
-        <w:t xml:space="preserve">172.20.0.0/16</w:t>
+        <w:t xml:space="preserve">172.16.0.0/16</w:t>
       </w:r>
       <w:r>
         <w:rPr>
@@ -16236,7 +16236,7 @@
                 <w:sz w:val="20"/>
                 <w:szCs w:val="20"/>
               </w:rPr>
-              <w:t xml:space="preserve">172.20.0.192/27</w:t>
+              <w:t xml:space="preserve">172.16.0.192/27</w:t>
             </w:r>
           </w:p>
         </w:tc>
@@ -16262,7 +16262,7 @@
                 <w:sz w:val="20"/>
                 <w:szCs w:val="20"/>
               </w:rPr>
-              <w:t xml:space="preserve">172.20.0.193</w:t>
+              <w:t xml:space="preserve">172.16.0.193</w:t>
             </w:r>
           </w:p>
         </w:tc>
@@ -16288,7 +16288,7 @@
                 <w:sz w:val="20"/>
                 <w:szCs w:val="20"/>
               </w:rPr>
-              <w:t xml:space="preserve">172.20.0.223</w:t>
+              <w:t xml:space="preserve">172.16.0.223</w:t>
             </w:r>
           </w:p>
         </w:tc>
@@ -16501,7 +16501,7 @@
                 <w:sz w:val="20"/>
                 <w:szCs w:val="20"/>
               </w:rPr>
-              <w:t xml:space="preserve">172.20.0.0/26</w:t>
+              <w:t xml:space="preserve">172.16.0.0/26</w:t>
             </w:r>
           </w:p>
         </w:tc>
@@ -16527,7 +16527,7 @@
                 <w:sz w:val="20"/>
                 <w:szCs w:val="20"/>
               </w:rPr>
-              <w:t xml:space="preserve">172.20.0.1</w:t>
+              <w:t xml:space="preserve">172.16.0.1</w:t>
             </w:r>
           </w:p>
         </w:tc>
@@ -16553,7 +16553,7 @@
                 <w:sz w:val="20"/>
                 <w:szCs w:val="20"/>
               </w:rPr>
-              <w:t xml:space="preserve">172.20.0.63</w:t>
+              <w:t xml:space="preserve">172.16.0.63</w:t>
             </w:r>
           </w:p>
         </w:tc>
@@ -16766,7 +16766,7 @@
                 <w:sz w:val="20"/>
                 <w:szCs w:val="20"/>
               </w:rPr>
-              <w:t xml:space="preserve">172.20.0.64/26</w:t>
+              <w:t xml:space="preserve">172.16.0.64/26</w:t>
             </w:r>
           </w:p>
         </w:tc>
@@ -16792,7 +16792,7 @@
                 <w:sz w:val="20"/>
                 <w:szCs w:val="20"/>
               </w:rPr>
-              <w:t xml:space="preserve">172.20.0.65</w:t>
+              <w:t xml:space="preserve">172.16.0.65</w:t>
             </w:r>
           </w:p>
         </w:tc>
@@ -16818,7 +16818,7 @@
                 <w:sz w:val="20"/>
                 <w:szCs w:val="20"/>
               </w:rPr>
-              <w:t xml:space="preserve">172.20.0.127</w:t>
+              <w:t xml:space="preserve">172.16.0.127</w:t>
             </w:r>
           </w:p>
         </w:tc>
@@ -17031,7 +17031,7 @@
                 <w:sz w:val="20"/>
                 <w:szCs w:val="20"/>
               </w:rPr>
-              <w:t xml:space="preserve">172.20.0.128/26</w:t>
+              <w:t xml:space="preserve">172.16.0.128/26</w:t>
             </w:r>
           </w:p>
         </w:tc>
@@ -17057,7 +17057,7 @@
                 <w:sz w:val="20"/>
                 <w:szCs w:val="20"/>
               </w:rPr>
-              <w:t xml:space="preserve">172.20.0.129</w:t>
+              <w:t xml:space="preserve">172.16.0.129</w:t>
             </w:r>
           </w:p>
         </w:tc>
@@ -17083,7 +17083,7 @@
                 <w:sz w:val="20"/>
                 <w:szCs w:val="20"/>
               </w:rPr>
-              <w:t xml:space="preserve">172.20.0.191</w:t>
+              <w:t xml:space="preserve">172.16.0.191</w:t>
             </w:r>
           </w:p>
         </w:tc>
@@ -17296,7 +17296,7 @@
                 <w:sz w:val="20"/>
                 <w:szCs w:val="20"/>
               </w:rPr>
-              <w:t xml:space="preserve">172.20.1.64/28</w:t>
+              <w:t xml:space="preserve">172.16.1.64/28</w:t>
             </w:r>
           </w:p>
         </w:tc>
@@ -17322,7 +17322,7 @@
                 <w:sz w:val="20"/>
                 <w:szCs w:val="20"/>
               </w:rPr>
-              <w:t xml:space="preserve">172.20.1.65</w:t>
+              <w:t xml:space="preserve">172.16.1.65</w:t>
             </w:r>
           </w:p>
         </w:tc>
@@ -17348,7 +17348,7 @@
                 <w:sz w:val="20"/>
                 <w:szCs w:val="20"/>
               </w:rPr>
-              <w:t xml:space="preserve">172.20.1.79</w:t>
+              <w:t xml:space="preserve">172.16.1.79</w:t>
             </w:r>
           </w:p>
         </w:tc>
@@ -17561,7 +17561,7 @@
                 <w:sz w:val="20"/>
                 <w:szCs w:val="20"/>
               </w:rPr>
-              <w:t xml:space="preserve">172.20.1.0/27</w:t>
+              <w:t xml:space="preserve">172.16.1.0/27</w:t>
             </w:r>
           </w:p>
         </w:tc>
@@ -17587,7 +17587,7 @@
                 <w:sz w:val="20"/>
                 <w:szCs w:val="20"/>
               </w:rPr>
-              <w:t xml:space="preserve">172.20.1.1</w:t>
+              <w:t xml:space="preserve">172.16.1.1</w:t>
             </w:r>
           </w:p>
         </w:tc>
@@ -17613,7 +17613,7 @@
                 <w:sz w:val="20"/>
                 <w:szCs w:val="20"/>
               </w:rPr>
-              <w:t xml:space="preserve">172.20.1.31</w:t>
+              <w:t xml:space="preserve">172.16.1.31</w:t>
             </w:r>
           </w:p>
         </w:tc>
@@ -17826,7 +17826,7 @@
                 <w:sz w:val="20"/>
                 <w:szCs w:val="20"/>
               </w:rPr>
-              <w:t xml:space="preserve">172.20.1.80/28</w:t>
+              <w:t xml:space="preserve">172.16.1.80/28</w:t>
             </w:r>
           </w:p>
         </w:tc>
@@ -17852,7 +17852,7 @@
                 <w:sz w:val="20"/>
                 <w:szCs w:val="20"/>
               </w:rPr>
-              <w:t xml:space="preserve">172.20.1.81</w:t>
+              <w:t xml:space="preserve">172.16.1.81</w:t>
             </w:r>
           </w:p>
         </w:tc>
@@ -17878,7 +17878,7 @@
                 <w:sz w:val="20"/>
                 <w:szCs w:val="20"/>
               </w:rPr>
-              <w:t xml:space="preserve">172.20.1.95</w:t>
+              <w:t xml:space="preserve">172.16.1.95</w:t>
             </w:r>
           </w:p>
         </w:tc>
@@ -18091,7 +18091,7 @@
                 <w:sz w:val="20"/>
                 <w:szCs w:val="20"/>
               </w:rPr>
-              <w:t xml:space="preserve">172.20.1.96/29</w:t>
+              <w:t xml:space="preserve">172.16.1.96/29</w:t>
             </w:r>
           </w:p>
         </w:tc>
@@ -18117,7 +18117,7 @@
                 <w:sz w:val="20"/>
                 <w:szCs w:val="20"/>
               </w:rPr>
-              <w:t xml:space="preserve">172.20.1.97</w:t>
+              <w:t xml:space="preserve">172.16.1.97</w:t>
             </w:r>
           </w:p>
         </w:tc>
@@ -18143,7 +18143,7 @@
                 <w:sz w:val="20"/>
                 <w:szCs w:val="20"/>
               </w:rPr>
-              <w:t xml:space="preserve">172.20.1.103</w:t>
+              <w:t xml:space="preserve">172.16.1.103</w:t>
             </w:r>
           </w:p>
         </w:tc>
@@ -18356,7 +18356,7 @@
                 <w:sz w:val="20"/>
                 <w:szCs w:val="20"/>
               </w:rPr>
-              <w:t xml:space="preserve">172.20.1.104/29</w:t>
+              <w:t xml:space="preserve">172.16.1.104/29</w:t>
             </w:r>
           </w:p>
         </w:tc>
@@ -18382,7 +18382,7 @@
                 <w:sz w:val="20"/>
                 <w:szCs w:val="20"/>
               </w:rPr>
-              <w:t xml:space="preserve">172.20.1.105 (VR1)</w:t>
+              <w:t xml:space="preserve">172.16.1.105 (VR1)</w:t>
             </w:r>
           </w:p>
         </w:tc>
@@ -18408,7 +18408,7 @@
                 <w:sz w:val="20"/>
                 <w:szCs w:val="20"/>
               </w:rPr>
-              <w:t xml:space="preserve">172.20.1.111</w:t>
+              <w:t xml:space="preserve">172.16.1.111</w:t>
             </w:r>
           </w:p>
         </w:tc>
@@ -18621,7 +18621,7 @@
                 <w:sz w:val="20"/>
                 <w:szCs w:val="20"/>
               </w:rPr>
-              <w:t xml:space="preserve">172.20.1.32/27</w:t>
+              <w:t xml:space="preserve">172.16.1.32/27</w:t>
             </w:r>
           </w:p>
         </w:tc>
@@ -18647,7 +18647,7 @@
                 <w:sz w:val="20"/>
                 <w:szCs w:val="20"/>
               </w:rPr>
-              <w:t xml:space="preserve">172.20.1.33</w:t>
+              <w:t xml:space="preserve">172.16.1.33</w:t>
             </w:r>
           </w:p>
         </w:tc>
@@ -18673,7 +18673,7 @@
                 <w:sz w:val="20"/>
                 <w:szCs w:val="20"/>
               </w:rPr>
-              <w:t xml:space="preserve">172.20.1.63</w:t>
+              <w:t xml:space="preserve">172.16.1.63</w:t>
             </w:r>
           </w:p>
         </w:tc>
@@ -18886,7 +18886,7 @@
                 <w:sz w:val="20"/>
                 <w:szCs w:val="20"/>
               </w:rPr>
-              <w:t xml:space="preserve">172.20.1.112/29</w:t>
+              <w:t xml:space="preserve">172.16.1.112/29</w:t>
             </w:r>
           </w:p>
         </w:tc>
@@ -18912,7 +18912,7 @@
                 <w:sz w:val="20"/>
                 <w:szCs w:val="20"/>
               </w:rPr>
-              <w:t xml:space="preserve">172.20.1.113</w:t>
+              <w:t xml:space="preserve">172.16.1.113</w:t>
             </w:r>
           </w:p>
         </w:tc>
@@ -18938,7 +18938,7 @@
                 <w:sz w:val="20"/>
                 <w:szCs w:val="20"/>
               </w:rPr>
-              <w:t xml:space="preserve">172.20.1.119</w:t>
+              <w:t xml:space="preserve">172.16.1.119</w:t>
             </w:r>
           </w:p>
         </w:tc>
@@ -19176,7 +19176,7 @@
                 <w:sz w:val="20"/>
                 <w:szCs w:val="20"/>
               </w:rPr>
-              <w:t xml:space="preserve">172.20.1.120/30</w:t>
+              <w:t xml:space="preserve">172.16.1.120/30</w:t>
             </w:r>
           </w:p>
         </w:tc>
@@ -19202,7 +19202,7 @@
                 <w:sz w:val="20"/>
                 <w:szCs w:val="20"/>
               </w:rPr>
-              <w:t xml:space="preserve">172.20.1.121</w:t>
+              <w:t xml:space="preserve">172.16.1.121</w:t>
             </w:r>
           </w:p>
         </w:tc>
@@ -19228,7 +19228,7 @@
                 <w:sz w:val="20"/>
                 <w:szCs w:val="20"/>
               </w:rPr>
-              <w:t xml:space="preserve">172.20.1.122</w:t>
+              <w:t xml:space="preserve">172.16.1.122</w:t>
             </w:r>
           </w:p>
         </w:tc>
@@ -19368,7 +19368,7 @@
                 <w:sz w:val="20"/>
                 <w:szCs w:val="20"/>
               </w:rPr>
-              <w:t xml:space="preserve">172.20.254.1/32</w:t>
+              <w:t xml:space="preserve">172.16.254.1/32</w:t>
             </w:r>
           </w:p>
         </w:tc>
@@ -19425,7 +19425,7 @@
                 <w:sz w:val="20"/>
                 <w:szCs w:val="20"/>
               </w:rPr>
-              <w:t xml:space="preserve">172.20.254.2/32</w:t>
+              <w:t xml:space="preserve">172.16.254.2/32</w:t>
             </w:r>
           </w:p>
         </w:tc>
@@ -39340,7 +39340,7 @@
                 <w:sz w:val="20"/>
                 <w:szCs w:val="20"/>
               </w:rPr>
-              <w:t xml:space="preserve">12, VLSM ajustado (bloque base 172.20.0.0/16)</w:t>
+              <w:t xml:space="preserve">12, VLSM ajustado (bloque base 172.16.0.0/16)</w:t>
             </w:r>
           </w:p>
         </w:tc>
@@ -40707,7 +40707,7 @@
                 <w:szCs w:val="20"/>
                 <w:shd w:fill="EDEDED" w:val="clear"/>
               </w:rPr>
-              <w:t xml:space="preserve">172.20.0.0/16</w:t>
+              <w:t xml:space="preserve">172.16.0.0/16</w:t>
             </w:r>
             <w:r>
               <w:rPr>
@@ -41381,7 +41381,7 @@
           <w:szCs w:val="20"/>
           <w:shd w:fill="EDEDED" w:val="clear"/>
         </w:rPr>
-        <w:t xml:space="preserve">172.20.0.0/16</w:t>
+        <w:t xml:space="preserve">172.16.0.0/16</w:t>
       </w:r>
       <w:r>
         <w:rPr>

</xml_diff>